<commit_message>
Felhasználói dokumentáció bővítése képekkel
</commit_message>
<xml_diff>
--- a/Dokumentációk/Felhasználói dokumentáció.docx
+++ b/Dokumentációk/Felhasználói dokumentáció.docx
@@ -115,7 +115,7 @@
           <w:lang w:eastAsia="hu-HU"/>
         </w:rPr>
         <w:pict>
-          <v:rect id="_x0000_i1047" style="width:0;height:1.5pt" o:hralign="center" o:hrstd="t" o:hr="t" fillcolor="#a0a0a0" stroked="f"/>
+          <v:rect id="_x0000_i1025" style="width:0;height:1.5pt" o:hralign="center" o:hrstd="t" o:hr="t" fillcolor="#a0a0a0" stroked="f"/>
         </w:pict>
       </w:r>
     </w:p>
@@ -434,7 +434,7 @@
           <w:lang w:eastAsia="hu-HU"/>
         </w:rPr>
         <w:pict>
-          <v:rect id="_x0000_i1048" style="width:0;height:1.5pt" o:hralign="center" o:hrstd="t" o:hr="t" fillcolor="#a0a0a0" stroked="f"/>
+          <v:rect id="_x0000_i1026" style="width:0;height:1.5pt" o:hralign="center" o:hrstd="t" o:hr="t" fillcolor="#a0a0a0" stroked="f"/>
         </w:pict>
       </w:r>
     </w:p>
@@ -508,27 +508,7 @@
           <w:szCs w:val="24"/>
           <w:lang w:eastAsia="hu-HU"/>
         </w:rPr>
-        <w:t xml:space="preserve"> és kattints a „MÉG NINCS FIÓKOD</w:t>
-      </w:r>
-      <w:proofErr w:type="gramStart"/>
-      <w:r>
-        <w:rPr>
-          <w:rFonts w:ascii="Times New Roman" w:eastAsia="Times New Roman" w:hAnsi="Times New Roman" w:cs="Times New Roman"/>
-          <w:sz w:val="24"/>
-          <w:szCs w:val="24"/>
-          <w:lang w:eastAsia="hu-HU"/>
-        </w:rPr>
-        <w:t xml:space="preserve">? </w:t>
-      </w:r>
-      <w:proofErr w:type="gramEnd"/>
-      <w:r>
-        <w:rPr>
-          <w:rFonts w:ascii="Times New Roman" w:eastAsia="Times New Roman" w:hAnsi="Times New Roman" w:cs="Times New Roman"/>
-          <w:sz w:val="24"/>
-          <w:szCs w:val="24"/>
-          <w:lang w:eastAsia="hu-HU"/>
-        </w:rPr>
-        <w:t>REGISZTRÁLJ!”</w:t>
+        <w:t xml:space="preserve"> és kattints a „MÉG NINCS FIÓKOD? REGISZTRÁLJ!”</w:t>
       </w:r>
       <w:r>
         <w:rPr>
@@ -692,6 +672,12 @@
         </w:rPr>
         <w:t>Jelöld be a „Elfogadom a Szolgáltatási Feltételeket” négyzetet.</w:t>
       </w:r>
+      <w:r>
+        <w:rPr>
+          <w:noProof/>
+        </w:rPr>
+        <w:t xml:space="preserve"> </w:t>
+      </w:r>
     </w:p>
     <w:p>
       <w:pPr>
@@ -737,6 +723,58 @@
         </w:rPr>
         <w:t>Sikeres regisztráció után automatikusan bejelentkezel, és egy üdvözlő e-mailt kapsz.</w:t>
       </w:r>
+      <w:r>
+        <w:rPr>
+          <w:rFonts w:ascii="Times New Roman" w:eastAsia="Times New Roman" w:hAnsi="Times New Roman" w:cs="Times New Roman"/>
+          <w:sz w:val="24"/>
+          <w:szCs w:val="24"/>
+          <w:lang w:eastAsia="hu-HU"/>
+        </w:rPr>
+        <w:t xml:space="preserve"> </w:t>
+      </w:r>
+      <w:r>
+        <w:rPr>
+          <w:rFonts w:ascii="Times New Roman" w:eastAsia="Times New Roman" w:hAnsi="Times New Roman" w:cs="Times New Roman"/>
+          <w:sz w:val="24"/>
+          <w:szCs w:val="24"/>
+          <w:lang w:eastAsia="hu-HU"/>
+        </w:rPr>
+        <w:drawing>
+          <wp:inline distT="0" distB="0" distL="0" distR="0" wp14:anchorId="3A56FA21" wp14:editId="35C695F6">
+            <wp:extent cx="5760720" cy="2843530"/>
+            <wp:effectExtent l="0" t="0" r="0" b="0"/>
+            <wp:docPr id="1" name="Kép 1"/>
+            <wp:cNvGraphicFramePr>
+              <a:graphicFrameLocks xmlns:a="http://schemas.openxmlformats.org/drawingml/2006/main" noChangeAspect="1"/>
+            </wp:cNvGraphicFramePr>
+            <a:graphic xmlns:a="http://schemas.openxmlformats.org/drawingml/2006/main">
+              <a:graphicData uri="http://schemas.openxmlformats.org/drawingml/2006/picture">
+                <pic:pic xmlns:pic="http://schemas.openxmlformats.org/drawingml/2006/picture">
+                  <pic:nvPicPr>
+                    <pic:cNvPr id="1" name=""/>
+                    <pic:cNvPicPr/>
+                  </pic:nvPicPr>
+                  <pic:blipFill>
+                    <a:blip r:embed="rId5"/>
+                    <a:stretch>
+                      <a:fillRect/>
+                    </a:stretch>
+                  </pic:blipFill>
+                  <pic:spPr>
+                    <a:xfrm>
+                      <a:off x="0" y="0"/>
+                      <a:ext cx="5760720" cy="2843530"/>
+                    </a:xfrm>
+                    <a:prstGeom prst="rect">
+                      <a:avLst/>
+                    </a:prstGeom>
+                  </pic:spPr>
+                </pic:pic>
+              </a:graphicData>
+            </a:graphic>
+          </wp:inline>
+        </w:drawing>
+      </w:r>
     </w:p>
     <w:p>
       <w:pPr>
@@ -781,6 +819,71 @@
           <w:szCs w:val="24"/>
           <w:lang w:eastAsia="hu-HU"/>
         </w:rPr>
+        <w:drawing>
+          <wp:anchor distT="0" distB="0" distL="114300" distR="114300" simplePos="0" relativeHeight="251658240" behindDoc="0" locked="0" layoutInCell="1" allowOverlap="1" wp14:anchorId="5A4299AC">
+            <wp:simplePos x="0" y="0"/>
+            <wp:positionH relativeFrom="margin">
+              <wp:align>right</wp:align>
+            </wp:positionH>
+            <wp:positionV relativeFrom="paragraph">
+              <wp:posOffset>304800</wp:posOffset>
+            </wp:positionV>
+            <wp:extent cx="5760720" cy="2824480"/>
+            <wp:effectExtent l="0" t="0" r="0" b="0"/>
+            <wp:wrapThrough wrapText="bothSides">
+              <wp:wrapPolygon edited="0">
+                <wp:start x="0" y="0"/>
+                <wp:lineTo x="0" y="21415"/>
+                <wp:lineTo x="21500" y="21415"/>
+                <wp:lineTo x="21500" y="0"/>
+                <wp:lineTo x="0" y="0"/>
+              </wp:wrapPolygon>
+            </wp:wrapThrough>
+            <wp:docPr id="2" name="Kép 2"/>
+            <wp:cNvGraphicFramePr>
+              <a:graphicFrameLocks xmlns:a="http://schemas.openxmlformats.org/drawingml/2006/main" noChangeAspect="1"/>
+            </wp:cNvGraphicFramePr>
+            <a:graphic xmlns:a="http://schemas.openxmlformats.org/drawingml/2006/main">
+              <a:graphicData uri="http://schemas.openxmlformats.org/drawingml/2006/picture">
+                <pic:pic xmlns:pic="http://schemas.openxmlformats.org/drawingml/2006/picture">
+                  <pic:nvPicPr>
+                    <pic:cNvPr id="1" name=""/>
+                    <pic:cNvPicPr/>
+                  </pic:nvPicPr>
+                  <pic:blipFill>
+                    <a:blip r:embed="rId6" cstate="print">
+                      <a:extLst>
+                        <a:ext uri="{28A0092B-C50C-407E-A947-70E740481C1C}">
+                          <a14:useLocalDpi xmlns:a14="http://schemas.microsoft.com/office/drawing/2010/main" val="0"/>
+                        </a:ext>
+                      </a:extLst>
+                    </a:blip>
+                    <a:stretch>
+                      <a:fillRect/>
+                    </a:stretch>
+                  </pic:blipFill>
+                  <pic:spPr>
+                    <a:xfrm>
+                      <a:off x="0" y="0"/>
+                      <a:ext cx="5760720" cy="2824480"/>
+                    </a:xfrm>
+                    <a:prstGeom prst="rect">
+                      <a:avLst/>
+                    </a:prstGeom>
+                  </pic:spPr>
+                </pic:pic>
+              </a:graphicData>
+            </a:graphic>
+          </wp:anchor>
+        </w:drawing>
+      </w:r>
+      <w:r>
+        <w:rPr>
+          <w:rFonts w:ascii="Times New Roman" w:eastAsia="Times New Roman" w:hAnsi="Times New Roman" w:cs="Times New Roman"/>
+          <w:sz w:val="24"/>
+          <w:szCs w:val="24"/>
+          <w:lang w:eastAsia="hu-HU"/>
+        </w:rPr>
         <w:t>Email + jelszó megadása</w:t>
       </w:r>
     </w:p>
@@ -802,7 +905,7 @@
           <w:lang w:eastAsia="hu-HU"/>
         </w:rPr>
         <w:pict>
-          <v:rect id="_x0000_i1049" style="width:0;height:1.5pt" o:hralign="center" o:hrstd="t" o:hr="t" fillcolor="#a0a0a0" stroked="f"/>
+          <v:rect id="_x0000_i1027" style="width:0;height:1.5pt" o:hralign="center" o:hrstd="t" o:hr="t" fillcolor="#a0a0a0" stroked="f"/>
         </w:pict>
       </w:r>
     </w:p>
@@ -935,6 +1038,7 @@
           <w:szCs w:val="24"/>
           <w:lang w:eastAsia="hu-HU"/>
         </w:rPr>
+        <w:lastRenderedPageBreak/>
         <w:t>Keresés: a keresősávban írj be kulcsszót (pl. „</w:t>
       </w:r>
       <w:r>
@@ -995,7 +1099,78 @@
           <w:szCs w:val="24"/>
           <w:lang w:eastAsia="hu-HU"/>
         </w:rPr>
+        <w:drawing>
+          <wp:anchor distT="0" distB="0" distL="114300" distR="114300" simplePos="0" relativeHeight="251659264" behindDoc="0" locked="0" layoutInCell="1" allowOverlap="1" wp14:anchorId="1C2F28BD">
+            <wp:simplePos x="0" y="0"/>
+            <wp:positionH relativeFrom="margin">
+              <wp:align>right</wp:align>
+            </wp:positionH>
+            <wp:positionV relativeFrom="paragraph">
+              <wp:posOffset>608965</wp:posOffset>
+            </wp:positionV>
+            <wp:extent cx="5760720" cy="2823845"/>
+            <wp:effectExtent l="0" t="0" r="0" b="0"/>
+            <wp:wrapThrough wrapText="bothSides">
+              <wp:wrapPolygon edited="0">
+                <wp:start x="0" y="0"/>
+                <wp:lineTo x="0" y="21420"/>
+                <wp:lineTo x="21500" y="21420"/>
+                <wp:lineTo x="21500" y="0"/>
+                <wp:lineTo x="0" y="0"/>
+              </wp:wrapPolygon>
+            </wp:wrapThrough>
+            <wp:docPr id="3" name="Kép 3"/>
+            <wp:cNvGraphicFramePr>
+              <a:graphicFrameLocks xmlns:a="http://schemas.openxmlformats.org/drawingml/2006/main" noChangeAspect="1"/>
+            </wp:cNvGraphicFramePr>
+            <a:graphic xmlns:a="http://schemas.openxmlformats.org/drawingml/2006/main">
+              <a:graphicData uri="http://schemas.openxmlformats.org/drawingml/2006/picture">
+                <pic:pic xmlns:pic="http://schemas.openxmlformats.org/drawingml/2006/picture">
+                  <pic:nvPicPr>
+                    <pic:cNvPr id="1" name=""/>
+                    <pic:cNvPicPr/>
+                  </pic:nvPicPr>
+                  <pic:blipFill>
+                    <a:blip r:embed="rId7" cstate="print">
+                      <a:extLst>
+                        <a:ext uri="{28A0092B-C50C-407E-A947-70E740481C1C}">
+                          <a14:useLocalDpi xmlns:a14="http://schemas.microsoft.com/office/drawing/2010/main" val="0"/>
+                        </a:ext>
+                      </a:extLst>
+                    </a:blip>
+                    <a:stretch>
+                      <a:fillRect/>
+                    </a:stretch>
+                  </pic:blipFill>
+                  <pic:spPr>
+                    <a:xfrm>
+                      <a:off x="0" y="0"/>
+                      <a:ext cx="5760720" cy="2823845"/>
+                    </a:xfrm>
+                    <a:prstGeom prst="rect">
+                      <a:avLst/>
+                    </a:prstGeom>
+                  </pic:spPr>
+                </pic:pic>
+              </a:graphicData>
+            </a:graphic>
+          </wp:anchor>
+        </w:drawing>
+      </w:r>
+      <w:r>
+        <w:rPr>
+          <w:rFonts w:ascii="Times New Roman" w:eastAsia="Times New Roman" w:hAnsi="Times New Roman" w:cs="Times New Roman"/>
+          <w:sz w:val="24"/>
+          <w:szCs w:val="24"/>
+          <w:lang w:eastAsia="hu-HU"/>
+        </w:rPr>
         <w:t>Méretválasztás: ruhák és cipők esetén automatikusan megjelenik a megfelelő méretlista (S–XXL ill. 36–46)</w:t>
+      </w:r>
+      <w:r>
+        <w:rPr>
+          <w:noProof/>
+        </w:rPr>
+        <w:t xml:space="preserve"> </w:t>
       </w:r>
     </w:p>
     <w:p>
@@ -1113,8 +1288,79 @@
           <w:szCs w:val="24"/>
           <w:lang w:eastAsia="hu-HU"/>
         </w:rPr>
+        <w:drawing>
+          <wp:anchor distT="0" distB="0" distL="114300" distR="114300" simplePos="0" relativeHeight="251660288" behindDoc="1" locked="0" layoutInCell="1" allowOverlap="1" wp14:anchorId="32935518">
+            <wp:simplePos x="0" y="0"/>
+            <wp:positionH relativeFrom="column">
+              <wp:posOffset>14605</wp:posOffset>
+            </wp:positionH>
+            <wp:positionV relativeFrom="paragraph">
+              <wp:posOffset>301625</wp:posOffset>
+            </wp:positionV>
+            <wp:extent cx="5760720" cy="2833370"/>
+            <wp:effectExtent l="0" t="0" r="0" b="5080"/>
+            <wp:wrapTight wrapText="bothSides">
+              <wp:wrapPolygon edited="0">
+                <wp:start x="0" y="0"/>
+                <wp:lineTo x="0" y="21494"/>
+                <wp:lineTo x="21500" y="21494"/>
+                <wp:lineTo x="21500" y="0"/>
+                <wp:lineTo x="0" y="0"/>
+              </wp:wrapPolygon>
+            </wp:wrapTight>
+            <wp:docPr id="4" name="Kép 4"/>
+            <wp:cNvGraphicFramePr>
+              <a:graphicFrameLocks xmlns:a="http://schemas.openxmlformats.org/drawingml/2006/main" noChangeAspect="1"/>
+            </wp:cNvGraphicFramePr>
+            <a:graphic xmlns:a="http://schemas.openxmlformats.org/drawingml/2006/main">
+              <a:graphicData uri="http://schemas.openxmlformats.org/drawingml/2006/picture">
+                <pic:pic xmlns:pic="http://schemas.openxmlformats.org/drawingml/2006/picture">
+                  <pic:nvPicPr>
+                    <pic:cNvPr id="1" name=""/>
+                    <pic:cNvPicPr/>
+                  </pic:nvPicPr>
+                  <pic:blipFill>
+                    <a:blip r:embed="rId8" cstate="print">
+                      <a:extLst>
+                        <a:ext uri="{28A0092B-C50C-407E-A947-70E740481C1C}">
+                          <a14:useLocalDpi xmlns:a14="http://schemas.microsoft.com/office/drawing/2010/main" val="0"/>
+                        </a:ext>
+                      </a:extLst>
+                    </a:blip>
+                    <a:stretch>
+                      <a:fillRect/>
+                    </a:stretch>
+                  </pic:blipFill>
+                  <pic:spPr>
+                    <a:xfrm>
+                      <a:off x="0" y="0"/>
+                      <a:ext cx="5760720" cy="2833370"/>
+                    </a:xfrm>
+                    <a:prstGeom prst="rect">
+                      <a:avLst/>
+                    </a:prstGeom>
+                  </pic:spPr>
+                </pic:pic>
+              </a:graphicData>
+            </a:graphic>
+          </wp:anchor>
+        </w:drawing>
+      </w:r>
+      <w:r>
+        <w:rPr>
+          <w:rFonts w:ascii="Times New Roman" w:eastAsia="Times New Roman" w:hAnsi="Times New Roman" w:cs="Times New Roman"/>
+          <w:sz w:val="24"/>
+          <w:szCs w:val="24"/>
+          <w:lang w:eastAsia="hu-HU"/>
+        </w:rPr>
         <w:t>„Kosárba” gomb (méret és mennyiség megadása kötelező)</w:t>
       </w:r>
+      <w:r>
+        <w:rPr>
+          <w:noProof/>
+        </w:rPr>
+        <w:t xml:space="preserve"> </w:t>
+      </w:r>
     </w:p>
     <w:p>
       <w:pPr>
@@ -1134,7 +1380,7 @@
           <w:lang w:eastAsia="hu-HU"/>
         </w:rPr>
         <w:pict>
-          <v:rect id="_x0000_i1050" style="width:0;height:1.5pt" o:hralign="center" o:hrstd="t" o:hr="t" fillcolor="#a0a0a0" stroked="f"/>
+          <v:rect id="_x0000_i1028" style="width:0;height:1.5pt" o:hralign="center" o:hrstd="t" o:hr="t" fillcolor="#a0a0a0" stroked="f"/>
         </w:pict>
       </w:r>
     </w:p>
@@ -1181,6 +1427,7 @@
           <w:szCs w:val="24"/>
           <w:lang w:eastAsia="hu-HU"/>
         </w:rPr>
+        <w:lastRenderedPageBreak/>
         <w:t>Válaszd ki a méretet és a mennyiséget.</w:t>
       </w:r>
     </w:p>
@@ -1301,6 +1548,71 @@
           <w:szCs w:val="24"/>
           <w:lang w:eastAsia="hu-HU"/>
         </w:rPr>
+        <w:drawing>
+          <wp:anchor distT="0" distB="0" distL="114300" distR="114300" simplePos="0" relativeHeight="251661312" behindDoc="0" locked="0" layoutInCell="1" allowOverlap="1" wp14:anchorId="4FB36594">
+            <wp:simplePos x="0" y="0"/>
+            <wp:positionH relativeFrom="margin">
+              <wp:align>right</wp:align>
+            </wp:positionH>
+            <wp:positionV relativeFrom="paragraph">
+              <wp:posOffset>252730</wp:posOffset>
+            </wp:positionV>
+            <wp:extent cx="5760720" cy="2818130"/>
+            <wp:effectExtent l="0" t="0" r="0" b="1270"/>
+            <wp:wrapThrough wrapText="bothSides">
+              <wp:wrapPolygon edited="0">
+                <wp:start x="0" y="0"/>
+                <wp:lineTo x="0" y="21464"/>
+                <wp:lineTo x="21500" y="21464"/>
+                <wp:lineTo x="21500" y="0"/>
+                <wp:lineTo x="0" y="0"/>
+              </wp:wrapPolygon>
+            </wp:wrapThrough>
+            <wp:docPr id="5" name="Kép 5"/>
+            <wp:cNvGraphicFramePr>
+              <a:graphicFrameLocks xmlns:a="http://schemas.openxmlformats.org/drawingml/2006/main" noChangeAspect="1"/>
+            </wp:cNvGraphicFramePr>
+            <a:graphic xmlns:a="http://schemas.openxmlformats.org/drawingml/2006/main">
+              <a:graphicData uri="http://schemas.openxmlformats.org/drawingml/2006/picture">
+                <pic:pic xmlns:pic="http://schemas.openxmlformats.org/drawingml/2006/picture">
+                  <pic:nvPicPr>
+                    <pic:cNvPr id="1" name=""/>
+                    <pic:cNvPicPr/>
+                  </pic:nvPicPr>
+                  <pic:blipFill>
+                    <a:blip r:embed="rId9" cstate="print">
+                      <a:extLst>
+                        <a:ext uri="{28A0092B-C50C-407E-A947-70E740481C1C}">
+                          <a14:useLocalDpi xmlns:a14="http://schemas.microsoft.com/office/drawing/2010/main" val="0"/>
+                        </a:ext>
+                      </a:extLst>
+                    </a:blip>
+                    <a:stretch>
+                      <a:fillRect/>
+                    </a:stretch>
+                  </pic:blipFill>
+                  <pic:spPr>
+                    <a:xfrm>
+                      <a:off x="0" y="0"/>
+                      <a:ext cx="5760720" cy="2818130"/>
+                    </a:xfrm>
+                    <a:prstGeom prst="rect">
+                      <a:avLst/>
+                    </a:prstGeom>
+                  </pic:spPr>
+                </pic:pic>
+              </a:graphicData>
+            </a:graphic>
+          </wp:anchor>
+        </w:drawing>
+      </w:r>
+      <w:r>
+        <w:rPr>
+          <w:rFonts w:ascii="Times New Roman" w:eastAsia="Times New Roman" w:hAnsi="Times New Roman" w:cs="Times New Roman"/>
+          <w:sz w:val="24"/>
+          <w:szCs w:val="24"/>
+          <w:lang w:eastAsia="hu-HU"/>
+        </w:rPr>
         <w:t>Törlés / mennyiség módosítás</w:t>
       </w:r>
     </w:p>
@@ -1322,7 +1634,7 @@
           <w:lang w:eastAsia="hu-HU"/>
         </w:rPr>
         <w:pict>
-          <v:rect id="_x0000_i1051" style="width:0;height:1.5pt" o:hralign="center" o:hrstd="t" o:hr="t" fillcolor="#a0a0a0" stroked="f"/>
+          <v:rect id="_x0000_i1029" style="width:0;height:1.5pt" o:hralign="center" o:hrstd="t" o:hr="t" fillcolor="#a0a0a0" stroked="f"/>
         </w:pict>
       </w:r>
     </w:p>
@@ -1345,7 +1657,6 @@
           <w:szCs w:val="24"/>
           <w:lang w:eastAsia="hu-HU"/>
         </w:rPr>
-        <w:lastRenderedPageBreak/>
         <w:t>5. Rendelés leadása</w:t>
       </w:r>
     </w:p>
@@ -1550,6 +1861,202 @@
           <w:szCs w:val="24"/>
           <w:lang w:eastAsia="hu-HU"/>
         </w:rPr>
+        <w:lastRenderedPageBreak/>
+        <w:drawing>
+          <wp:anchor distT="0" distB="0" distL="114300" distR="114300" simplePos="0" relativeHeight="251663360" behindDoc="0" locked="0" layoutInCell="1" allowOverlap="1" wp14:anchorId="20FE17BC">
+            <wp:simplePos x="0" y="0"/>
+            <wp:positionH relativeFrom="margin">
+              <wp:align>right</wp:align>
+            </wp:positionH>
+            <wp:positionV relativeFrom="paragraph">
+              <wp:posOffset>3276600</wp:posOffset>
+            </wp:positionV>
+            <wp:extent cx="5760720" cy="2778760"/>
+            <wp:effectExtent l="0" t="0" r="0" b="2540"/>
+            <wp:wrapThrough wrapText="bothSides">
+              <wp:wrapPolygon edited="0">
+                <wp:start x="0" y="0"/>
+                <wp:lineTo x="0" y="21472"/>
+                <wp:lineTo x="21500" y="21472"/>
+                <wp:lineTo x="21500" y="0"/>
+                <wp:lineTo x="0" y="0"/>
+              </wp:wrapPolygon>
+            </wp:wrapThrough>
+            <wp:docPr id="7" name="Kép 7"/>
+            <wp:cNvGraphicFramePr>
+              <a:graphicFrameLocks xmlns:a="http://schemas.openxmlformats.org/drawingml/2006/main" noChangeAspect="1"/>
+            </wp:cNvGraphicFramePr>
+            <a:graphic xmlns:a="http://schemas.openxmlformats.org/drawingml/2006/main">
+              <a:graphicData uri="http://schemas.openxmlformats.org/drawingml/2006/picture">
+                <pic:pic xmlns:pic="http://schemas.openxmlformats.org/drawingml/2006/picture">
+                  <pic:nvPicPr>
+                    <pic:cNvPr id="1" name=""/>
+                    <pic:cNvPicPr/>
+                  </pic:nvPicPr>
+                  <pic:blipFill>
+                    <a:blip r:embed="rId10" cstate="print">
+                      <a:extLst>
+                        <a:ext uri="{28A0092B-C50C-407E-A947-70E740481C1C}">
+                          <a14:useLocalDpi xmlns:a14="http://schemas.microsoft.com/office/drawing/2010/main" val="0"/>
+                        </a:ext>
+                      </a:extLst>
+                    </a:blip>
+                    <a:stretch>
+                      <a:fillRect/>
+                    </a:stretch>
+                  </pic:blipFill>
+                  <pic:spPr>
+                    <a:xfrm>
+                      <a:off x="0" y="0"/>
+                      <a:ext cx="5760720" cy="2778760"/>
+                    </a:xfrm>
+                    <a:prstGeom prst="rect">
+                      <a:avLst/>
+                    </a:prstGeom>
+                  </pic:spPr>
+                </pic:pic>
+              </a:graphicData>
+            </a:graphic>
+          </wp:anchor>
+        </w:drawing>
+      </w:r>
+      <w:r>
+        <w:rPr>
+          <w:rFonts w:ascii="Times New Roman" w:eastAsia="Times New Roman" w:hAnsi="Times New Roman" w:cs="Times New Roman"/>
+          <w:sz w:val="24"/>
+          <w:szCs w:val="24"/>
+          <w:lang w:eastAsia="hu-HU"/>
+        </w:rPr>
+        <w:drawing>
+          <wp:anchor distT="0" distB="0" distL="114300" distR="114300" simplePos="0" relativeHeight="251664384" behindDoc="0" locked="0" layoutInCell="1" allowOverlap="1" wp14:anchorId="50E97A10">
+            <wp:simplePos x="0" y="0"/>
+            <wp:positionH relativeFrom="margin">
+              <wp:align>right</wp:align>
+            </wp:positionH>
+            <wp:positionV relativeFrom="paragraph">
+              <wp:posOffset>6069965</wp:posOffset>
+            </wp:positionV>
+            <wp:extent cx="5760720" cy="2813050"/>
+            <wp:effectExtent l="0" t="0" r="0" b="6350"/>
+            <wp:wrapThrough wrapText="bothSides">
+              <wp:wrapPolygon edited="0">
+                <wp:start x="0" y="0"/>
+                <wp:lineTo x="0" y="21502"/>
+                <wp:lineTo x="21500" y="21502"/>
+                <wp:lineTo x="21500" y="0"/>
+                <wp:lineTo x="0" y="0"/>
+              </wp:wrapPolygon>
+            </wp:wrapThrough>
+            <wp:docPr id="8" name="Kép 8"/>
+            <wp:cNvGraphicFramePr>
+              <a:graphicFrameLocks xmlns:a="http://schemas.openxmlformats.org/drawingml/2006/main" noChangeAspect="1"/>
+            </wp:cNvGraphicFramePr>
+            <a:graphic xmlns:a="http://schemas.openxmlformats.org/drawingml/2006/main">
+              <a:graphicData uri="http://schemas.openxmlformats.org/drawingml/2006/picture">
+                <pic:pic xmlns:pic="http://schemas.openxmlformats.org/drawingml/2006/picture">
+                  <pic:nvPicPr>
+                    <pic:cNvPr id="1" name=""/>
+                    <pic:cNvPicPr/>
+                  </pic:nvPicPr>
+                  <pic:blipFill>
+                    <a:blip r:embed="rId11" cstate="print">
+                      <a:extLst>
+                        <a:ext uri="{28A0092B-C50C-407E-A947-70E740481C1C}">
+                          <a14:useLocalDpi xmlns:a14="http://schemas.microsoft.com/office/drawing/2010/main" val="0"/>
+                        </a:ext>
+                      </a:extLst>
+                    </a:blip>
+                    <a:stretch>
+                      <a:fillRect/>
+                    </a:stretch>
+                  </pic:blipFill>
+                  <pic:spPr>
+                    <a:xfrm>
+                      <a:off x="0" y="0"/>
+                      <a:ext cx="5760720" cy="2813050"/>
+                    </a:xfrm>
+                    <a:prstGeom prst="rect">
+                      <a:avLst/>
+                    </a:prstGeom>
+                  </pic:spPr>
+                </pic:pic>
+              </a:graphicData>
+            </a:graphic>
+          </wp:anchor>
+        </w:drawing>
+      </w:r>
+      <w:r>
+        <w:rPr>
+          <w:rFonts w:ascii="Times New Roman" w:eastAsia="Times New Roman" w:hAnsi="Times New Roman" w:cs="Times New Roman"/>
+          <w:sz w:val="24"/>
+          <w:szCs w:val="24"/>
+          <w:lang w:eastAsia="hu-HU"/>
+        </w:rPr>
+        <w:drawing>
+          <wp:anchor distT="0" distB="0" distL="114300" distR="114300" simplePos="0" relativeHeight="251662336" behindDoc="0" locked="0" layoutInCell="1" allowOverlap="1" wp14:anchorId="054AEEAC">
+            <wp:simplePos x="0" y="0"/>
+            <wp:positionH relativeFrom="margin">
+              <wp:align>right</wp:align>
+            </wp:positionH>
+            <wp:positionV relativeFrom="paragraph">
+              <wp:posOffset>328930</wp:posOffset>
+            </wp:positionV>
+            <wp:extent cx="5760720" cy="2868295"/>
+            <wp:effectExtent l="0" t="0" r="0" b="8255"/>
+            <wp:wrapThrough wrapText="bothSides">
+              <wp:wrapPolygon edited="0">
+                <wp:start x="0" y="0"/>
+                <wp:lineTo x="0" y="21519"/>
+                <wp:lineTo x="21500" y="21519"/>
+                <wp:lineTo x="21500" y="0"/>
+                <wp:lineTo x="0" y="0"/>
+              </wp:wrapPolygon>
+            </wp:wrapThrough>
+            <wp:docPr id="6" name="Kép 6"/>
+            <wp:cNvGraphicFramePr>
+              <a:graphicFrameLocks xmlns:a="http://schemas.openxmlformats.org/drawingml/2006/main" noChangeAspect="1"/>
+            </wp:cNvGraphicFramePr>
+            <a:graphic xmlns:a="http://schemas.openxmlformats.org/drawingml/2006/main">
+              <a:graphicData uri="http://schemas.openxmlformats.org/drawingml/2006/picture">
+                <pic:pic xmlns:pic="http://schemas.openxmlformats.org/drawingml/2006/picture">
+                  <pic:nvPicPr>
+                    <pic:cNvPr id="1" name=""/>
+                    <pic:cNvPicPr/>
+                  </pic:nvPicPr>
+                  <pic:blipFill>
+                    <a:blip r:embed="rId12" cstate="print">
+                      <a:extLst>
+                        <a:ext uri="{28A0092B-C50C-407E-A947-70E740481C1C}">
+                          <a14:useLocalDpi xmlns:a14="http://schemas.microsoft.com/office/drawing/2010/main" val="0"/>
+                        </a:ext>
+                      </a:extLst>
+                    </a:blip>
+                    <a:stretch>
+                      <a:fillRect/>
+                    </a:stretch>
+                  </pic:blipFill>
+                  <pic:spPr>
+                    <a:xfrm>
+                      <a:off x="0" y="0"/>
+                      <a:ext cx="5760720" cy="2868295"/>
+                    </a:xfrm>
+                    <a:prstGeom prst="rect">
+                      <a:avLst/>
+                    </a:prstGeom>
+                  </pic:spPr>
+                </pic:pic>
+              </a:graphicData>
+            </a:graphic>
+          </wp:anchor>
+        </w:drawing>
+      </w:r>
+      <w:r>
+        <w:rPr>
+          <w:rFonts w:ascii="Times New Roman" w:eastAsia="Times New Roman" w:hAnsi="Times New Roman" w:cs="Times New Roman"/>
+          <w:sz w:val="24"/>
+          <w:szCs w:val="24"/>
+          <w:lang w:eastAsia="hu-HU"/>
+        </w:rPr>
         <w:t>A rendelés azonnal megjelenik a Profil → Rendeléseim menüben</w:t>
       </w:r>
     </w:p>
@@ -1570,8 +2077,9 @@
           <w:szCs w:val="24"/>
           <w:lang w:eastAsia="hu-HU"/>
         </w:rPr>
+        <w:lastRenderedPageBreak/>
         <w:pict>
-          <v:rect id="_x0000_i1052" style="width:0;height:1.5pt" o:hralign="center" o:hrstd="t" o:hr="t" fillcolor="#a0a0a0" stroked="f"/>
+          <v:rect id="_x0000_i1030" style="width:0;height:1.5pt" o:hralign="center" o:hrstd="t" o:hr="t" fillcolor="#a0a0a0" stroked="f"/>
         </w:pict>
       </w:r>
     </w:p>
@@ -1837,6 +2345,133 @@
       </w:pPr>
       <w:r>
         <w:rPr>
+          <w:noProof/>
+        </w:rPr>
+        <w:drawing>
+          <wp:anchor distT="0" distB="0" distL="114300" distR="114300" simplePos="0" relativeHeight="251666432" behindDoc="0" locked="0" layoutInCell="1" allowOverlap="1" wp14:anchorId="1FC25AA1">
+            <wp:simplePos x="0" y="0"/>
+            <wp:positionH relativeFrom="margin">
+              <wp:align>right</wp:align>
+            </wp:positionH>
+            <wp:positionV relativeFrom="paragraph">
+              <wp:posOffset>3284855</wp:posOffset>
+            </wp:positionV>
+            <wp:extent cx="5760720" cy="2174240"/>
+            <wp:effectExtent l="0" t="0" r="0" b="0"/>
+            <wp:wrapThrough wrapText="bothSides">
+              <wp:wrapPolygon edited="0">
+                <wp:start x="0" y="0"/>
+                <wp:lineTo x="0" y="21386"/>
+                <wp:lineTo x="21500" y="21386"/>
+                <wp:lineTo x="21500" y="0"/>
+                <wp:lineTo x="0" y="0"/>
+              </wp:wrapPolygon>
+            </wp:wrapThrough>
+            <wp:docPr id="10" name="Kép 10"/>
+            <wp:cNvGraphicFramePr>
+              <a:graphicFrameLocks xmlns:a="http://schemas.openxmlformats.org/drawingml/2006/main" noChangeAspect="1"/>
+            </wp:cNvGraphicFramePr>
+            <a:graphic xmlns:a="http://schemas.openxmlformats.org/drawingml/2006/main">
+              <a:graphicData uri="http://schemas.openxmlformats.org/drawingml/2006/picture">
+                <pic:pic xmlns:pic="http://schemas.openxmlformats.org/drawingml/2006/picture">
+                  <pic:nvPicPr>
+                    <pic:cNvPr id="1" name=""/>
+                    <pic:cNvPicPr/>
+                  </pic:nvPicPr>
+                  <pic:blipFill>
+                    <a:blip r:embed="rId13" cstate="print">
+                      <a:extLst>
+                        <a:ext uri="{28A0092B-C50C-407E-A947-70E740481C1C}">
+                          <a14:useLocalDpi xmlns:a14="http://schemas.microsoft.com/office/drawing/2010/main" val="0"/>
+                        </a:ext>
+                      </a:extLst>
+                    </a:blip>
+                    <a:stretch>
+                      <a:fillRect/>
+                    </a:stretch>
+                  </pic:blipFill>
+                  <pic:spPr>
+                    <a:xfrm>
+                      <a:off x="0" y="0"/>
+                      <a:ext cx="5760720" cy="2174240"/>
+                    </a:xfrm>
+                    <a:prstGeom prst="rect">
+                      <a:avLst/>
+                    </a:prstGeom>
+                  </pic:spPr>
+                </pic:pic>
+              </a:graphicData>
+            </a:graphic>
+          </wp:anchor>
+        </w:drawing>
+      </w:r>
+      <w:r>
+        <w:rPr>
+          <w:rFonts w:ascii="Times New Roman" w:eastAsia="Times New Roman" w:hAnsi="Times New Roman" w:cs="Times New Roman"/>
+          <w:sz w:val="24"/>
+          <w:szCs w:val="24"/>
+          <w:lang w:eastAsia="hu-HU"/>
+        </w:rPr>
+        <w:drawing>
+          <wp:anchor distT="0" distB="0" distL="114300" distR="114300" simplePos="0" relativeHeight="251665408" behindDoc="0" locked="0" layoutInCell="1" allowOverlap="1" wp14:anchorId="309C831C">
+            <wp:simplePos x="0" y="0"/>
+            <wp:positionH relativeFrom="margin">
+              <wp:align>right</wp:align>
+            </wp:positionH>
+            <wp:positionV relativeFrom="paragraph">
+              <wp:posOffset>498475</wp:posOffset>
+            </wp:positionV>
+            <wp:extent cx="5760720" cy="2593340"/>
+            <wp:effectExtent l="0" t="0" r="0" b="0"/>
+            <wp:wrapThrough wrapText="bothSides">
+              <wp:wrapPolygon edited="0">
+                <wp:start x="0" y="0"/>
+                <wp:lineTo x="0" y="21420"/>
+                <wp:lineTo x="21500" y="21420"/>
+                <wp:lineTo x="21500" y="0"/>
+                <wp:lineTo x="0" y="0"/>
+              </wp:wrapPolygon>
+            </wp:wrapThrough>
+            <wp:docPr id="9" name="Kép 9"/>
+            <wp:cNvGraphicFramePr>
+              <a:graphicFrameLocks xmlns:a="http://schemas.openxmlformats.org/drawingml/2006/main" noChangeAspect="1"/>
+            </wp:cNvGraphicFramePr>
+            <a:graphic xmlns:a="http://schemas.openxmlformats.org/drawingml/2006/main">
+              <a:graphicData uri="http://schemas.openxmlformats.org/drawingml/2006/picture">
+                <pic:pic xmlns:pic="http://schemas.openxmlformats.org/drawingml/2006/picture">
+                  <pic:nvPicPr>
+                    <pic:cNvPr id="1" name=""/>
+                    <pic:cNvPicPr/>
+                  </pic:nvPicPr>
+                  <pic:blipFill>
+                    <a:blip r:embed="rId14" cstate="print">
+                      <a:extLst>
+                        <a:ext uri="{28A0092B-C50C-407E-A947-70E740481C1C}">
+                          <a14:useLocalDpi xmlns:a14="http://schemas.microsoft.com/office/drawing/2010/main" val="0"/>
+                        </a:ext>
+                      </a:extLst>
+                    </a:blip>
+                    <a:stretch>
+                      <a:fillRect/>
+                    </a:stretch>
+                  </pic:blipFill>
+                  <pic:spPr>
+                    <a:xfrm>
+                      <a:off x="0" y="0"/>
+                      <a:ext cx="5760720" cy="2593340"/>
+                    </a:xfrm>
+                    <a:prstGeom prst="rect">
+                      <a:avLst/>
+                    </a:prstGeom>
+                  </pic:spPr>
+                </pic:pic>
+              </a:graphicData>
+            </a:graphic>
+          </wp:anchor>
+        </w:drawing>
+      </w:r>
+      <w:r>
+        <w:rPr>
           <w:rFonts w:ascii="Times New Roman" w:eastAsia="Times New Roman" w:hAnsi="Times New Roman" w:cs="Times New Roman"/>
           <w:sz w:val="24"/>
           <w:szCs w:val="24"/>
@@ -1868,6 +2503,12 @@
         </w:rPr>
         <w:t>Fiók törlése (visszafordíthatatlan!)</w:t>
       </w:r>
+      <w:r>
+        <w:rPr>
+          <w:noProof/>
+        </w:rPr>
+        <w:t xml:space="preserve"> </w:t>
+      </w:r>
     </w:p>
     <w:p>
       <w:pPr>
@@ -1881,13 +2522,76 @@
       </w:pPr>
       <w:r>
         <w:rPr>
+          <w:noProof/>
+        </w:rPr>
+        <w:lastRenderedPageBreak/>
+        <w:drawing>
+          <wp:anchor distT="0" distB="0" distL="114300" distR="114300" simplePos="0" relativeHeight="251667456" behindDoc="0" locked="0" layoutInCell="1" allowOverlap="1" wp14:anchorId="0A56443F">
+            <wp:simplePos x="0" y="0"/>
+            <wp:positionH relativeFrom="margin">
+              <wp:align>right</wp:align>
+            </wp:positionH>
+            <wp:positionV relativeFrom="paragraph">
+              <wp:posOffset>0</wp:posOffset>
+            </wp:positionV>
+            <wp:extent cx="5760720" cy="2240915"/>
+            <wp:effectExtent l="0" t="0" r="0" b="6985"/>
+            <wp:wrapThrough wrapText="bothSides">
+              <wp:wrapPolygon edited="0">
+                <wp:start x="0" y="0"/>
+                <wp:lineTo x="0" y="21484"/>
+                <wp:lineTo x="21500" y="21484"/>
+                <wp:lineTo x="21500" y="0"/>
+                <wp:lineTo x="0" y="0"/>
+              </wp:wrapPolygon>
+            </wp:wrapThrough>
+            <wp:docPr id="11" name="Kép 11"/>
+            <wp:cNvGraphicFramePr>
+              <a:graphicFrameLocks xmlns:a="http://schemas.openxmlformats.org/drawingml/2006/main" noChangeAspect="1"/>
+            </wp:cNvGraphicFramePr>
+            <a:graphic xmlns:a="http://schemas.openxmlformats.org/drawingml/2006/main">
+              <a:graphicData uri="http://schemas.openxmlformats.org/drawingml/2006/picture">
+                <pic:pic xmlns:pic="http://schemas.openxmlformats.org/drawingml/2006/picture">
+                  <pic:nvPicPr>
+                    <pic:cNvPr id="1" name=""/>
+                    <pic:cNvPicPr/>
+                  </pic:nvPicPr>
+                  <pic:blipFill>
+                    <a:blip r:embed="rId15" cstate="print">
+                      <a:extLst>
+                        <a:ext uri="{28A0092B-C50C-407E-A947-70E740481C1C}">
+                          <a14:useLocalDpi xmlns:a14="http://schemas.microsoft.com/office/drawing/2010/main" val="0"/>
+                        </a:ext>
+                      </a:extLst>
+                    </a:blip>
+                    <a:stretch>
+                      <a:fillRect/>
+                    </a:stretch>
+                  </pic:blipFill>
+                  <pic:spPr>
+                    <a:xfrm>
+                      <a:off x="0" y="0"/>
+                      <a:ext cx="5760720" cy="2240915"/>
+                    </a:xfrm>
+                    <a:prstGeom prst="rect">
+                      <a:avLst/>
+                    </a:prstGeom>
+                  </pic:spPr>
+                </pic:pic>
+              </a:graphicData>
+            </a:graphic>
+          </wp:anchor>
+        </w:drawing>
+      </w:r>
+      <w:r>
+        <w:rPr>
           <w:rFonts w:ascii="Times New Roman" w:eastAsia="Times New Roman" w:hAnsi="Times New Roman" w:cs="Times New Roman"/>
           <w:sz w:val="24"/>
           <w:szCs w:val="24"/>
           <w:lang w:eastAsia="hu-HU"/>
         </w:rPr>
         <w:pict>
-          <v:rect id="_x0000_i1053" style="width:0;height:1.5pt" o:hralign="center" o:hrstd="t" o:hr="t" fillcolor="#a0a0a0" stroked="f"/>
+          <v:rect id="_x0000_i1031" style="width:0;height:1.5pt" o:hralign="center" o:hrstd="t" o:hr="t" fillcolor="#a0a0a0" stroked="f"/>
         </w:pict>
       </w:r>
     </w:p>
@@ -2058,9 +2762,79 @@
           <w:szCs w:val="24"/>
           <w:lang w:eastAsia="hu-HU"/>
         </w:rPr>
-        <w:lastRenderedPageBreak/>
+        <w:drawing>
+          <wp:anchor distT="0" distB="0" distL="114300" distR="114300" simplePos="0" relativeHeight="251668480" behindDoc="0" locked="0" layoutInCell="1" allowOverlap="1" wp14:anchorId="55EA533B">
+            <wp:simplePos x="0" y="0"/>
+            <wp:positionH relativeFrom="margin">
+              <wp:align>right</wp:align>
+            </wp:positionH>
+            <wp:positionV relativeFrom="paragraph">
+              <wp:posOffset>296545</wp:posOffset>
+            </wp:positionV>
+            <wp:extent cx="5760720" cy="1511300"/>
+            <wp:effectExtent l="0" t="0" r="0" b="0"/>
+            <wp:wrapThrough wrapText="bothSides">
+              <wp:wrapPolygon edited="0">
+                <wp:start x="0" y="0"/>
+                <wp:lineTo x="0" y="21237"/>
+                <wp:lineTo x="21500" y="21237"/>
+                <wp:lineTo x="21500" y="0"/>
+                <wp:lineTo x="0" y="0"/>
+              </wp:wrapPolygon>
+            </wp:wrapThrough>
+            <wp:docPr id="12" name="Kép 12"/>
+            <wp:cNvGraphicFramePr>
+              <a:graphicFrameLocks xmlns:a="http://schemas.openxmlformats.org/drawingml/2006/main" noChangeAspect="1"/>
+            </wp:cNvGraphicFramePr>
+            <a:graphic xmlns:a="http://schemas.openxmlformats.org/drawingml/2006/main">
+              <a:graphicData uri="http://schemas.openxmlformats.org/drawingml/2006/picture">
+                <pic:pic xmlns:pic="http://schemas.openxmlformats.org/drawingml/2006/picture">
+                  <pic:nvPicPr>
+                    <pic:cNvPr id="1" name=""/>
+                    <pic:cNvPicPr/>
+                  </pic:nvPicPr>
+                  <pic:blipFill>
+                    <a:blip r:embed="rId16" cstate="print">
+                      <a:extLst>
+                        <a:ext uri="{28A0092B-C50C-407E-A947-70E740481C1C}">
+                          <a14:useLocalDpi xmlns:a14="http://schemas.microsoft.com/office/drawing/2010/main" val="0"/>
+                        </a:ext>
+                      </a:extLst>
+                    </a:blip>
+                    <a:stretch>
+                      <a:fillRect/>
+                    </a:stretch>
+                  </pic:blipFill>
+                  <pic:spPr>
+                    <a:xfrm>
+                      <a:off x="0" y="0"/>
+                      <a:ext cx="5760720" cy="1511300"/>
+                    </a:xfrm>
+                    <a:prstGeom prst="rect">
+                      <a:avLst/>
+                    </a:prstGeom>
+                  </pic:spPr>
+                </pic:pic>
+              </a:graphicData>
+            </a:graphic>
+          </wp:anchor>
+        </w:drawing>
+      </w:r>
+      <w:r>
+        <w:rPr>
+          <w:rFonts w:ascii="Times New Roman" w:eastAsia="Times New Roman" w:hAnsi="Times New Roman" w:cs="Times New Roman"/>
+          <w:sz w:val="24"/>
+          <w:szCs w:val="24"/>
+          <w:lang w:eastAsia="hu-HU"/>
+        </w:rPr>
         <w:t>Csak egyszer értékelhetsz egy terméket. Az értékelések azonnal megjelennek az oldalon.</w:t>
       </w:r>
+      <w:r>
+        <w:rPr>
+          <w:noProof/>
+        </w:rPr>
+        <w:t xml:space="preserve"> </w:t>
+      </w:r>
     </w:p>
     <w:p>
       <w:pPr>
@@ -2080,7 +2854,7 @@
           <w:lang w:eastAsia="hu-HU"/>
         </w:rPr>
         <w:pict>
-          <v:rect id="_x0000_i1054" style="width:0;height:1.5pt" o:hralign="center" o:hrstd="t" o:hr="t" fillcolor="#a0a0a0" stroked="f"/>
+          <v:rect id="_x0000_i1032" style="width:0;height:1.5pt" o:hralign="center" o:hrstd="t" o:hr="t" fillcolor="#a0a0a0" stroked="f"/>
         </w:pict>
       </w:r>
     </w:p>
@@ -2258,8 +3032,6 @@
         </w:rPr>
         <w:t>, kép feltöltés</w:t>
       </w:r>
-      <w:bookmarkStart w:id="0" w:name="_GoBack"/>
-      <w:bookmarkEnd w:id="0"/>
     </w:p>
     <w:p>
       <w:pPr>
@@ -2351,16 +3123,7 @@
           <w:szCs w:val="24"/>
           <w:lang w:eastAsia="hu-HU"/>
         </w:rPr>
-        <w:t xml:space="preserve">, </w:t>
-      </w:r>
-      <w:r>
-        <w:rPr>
-          <w:rFonts w:ascii="Times New Roman" w:eastAsia="Times New Roman" w:hAnsi="Times New Roman" w:cs="Times New Roman"/>
-          <w:sz w:val="24"/>
-          <w:szCs w:val="24"/>
-          <w:lang w:eastAsia="hu-HU"/>
-        </w:rPr>
-        <w:t xml:space="preserve">listázás, keresés, </w:t>
+        <w:t xml:space="preserve">, listázás, keresés, </w:t>
       </w:r>
       <w:r>
         <w:rPr>
@@ -2426,6 +3189,7 @@
           <w:szCs w:val="24"/>
           <w:lang w:eastAsia="hu-HU"/>
         </w:rPr>
+        <w:lastRenderedPageBreak/>
         <w:t>Statisztikák: havi bevétel diagram</w:t>
       </w:r>
       <w:r>
@@ -2450,6 +3214,195 @@
       </w:pPr>
       <w:r>
         <w:rPr>
+          <w:noProof/>
+        </w:rPr>
+        <w:drawing>
+          <wp:anchor distT="0" distB="0" distL="114300" distR="114300" simplePos="0" relativeHeight="251670528" behindDoc="0" locked="0" layoutInCell="1" allowOverlap="1" wp14:anchorId="40013251">
+            <wp:simplePos x="0" y="0"/>
+            <wp:positionH relativeFrom="column">
+              <wp:posOffset>-118745</wp:posOffset>
+            </wp:positionH>
+            <wp:positionV relativeFrom="paragraph">
+              <wp:posOffset>3014980</wp:posOffset>
+            </wp:positionV>
+            <wp:extent cx="5760720" cy="2795905"/>
+            <wp:effectExtent l="0" t="0" r="0" b="4445"/>
+            <wp:wrapThrough wrapText="bothSides">
+              <wp:wrapPolygon edited="0">
+                <wp:start x="0" y="0"/>
+                <wp:lineTo x="0" y="21487"/>
+                <wp:lineTo x="21500" y="21487"/>
+                <wp:lineTo x="21500" y="0"/>
+                <wp:lineTo x="0" y="0"/>
+              </wp:wrapPolygon>
+            </wp:wrapThrough>
+            <wp:docPr id="14" name="Kép 14"/>
+            <wp:cNvGraphicFramePr>
+              <a:graphicFrameLocks xmlns:a="http://schemas.openxmlformats.org/drawingml/2006/main" noChangeAspect="1"/>
+            </wp:cNvGraphicFramePr>
+            <a:graphic xmlns:a="http://schemas.openxmlformats.org/drawingml/2006/main">
+              <a:graphicData uri="http://schemas.openxmlformats.org/drawingml/2006/picture">
+                <pic:pic xmlns:pic="http://schemas.openxmlformats.org/drawingml/2006/picture">
+                  <pic:nvPicPr>
+                    <pic:cNvPr id="1" name=""/>
+                    <pic:cNvPicPr/>
+                  </pic:nvPicPr>
+                  <pic:blipFill>
+                    <a:blip r:embed="rId17" cstate="print">
+                      <a:extLst>
+                        <a:ext uri="{28A0092B-C50C-407E-A947-70E740481C1C}">
+                          <a14:useLocalDpi xmlns:a14="http://schemas.microsoft.com/office/drawing/2010/main" val="0"/>
+                        </a:ext>
+                      </a:extLst>
+                    </a:blip>
+                    <a:stretch>
+                      <a:fillRect/>
+                    </a:stretch>
+                  </pic:blipFill>
+                  <pic:spPr>
+                    <a:xfrm>
+                      <a:off x="0" y="0"/>
+                      <a:ext cx="5760720" cy="2795905"/>
+                    </a:xfrm>
+                    <a:prstGeom prst="rect">
+                      <a:avLst/>
+                    </a:prstGeom>
+                  </pic:spPr>
+                </pic:pic>
+              </a:graphicData>
+            </a:graphic>
+          </wp:anchor>
+        </w:drawing>
+      </w:r>
+      <w:r>
+        <w:rPr>
+          <w:noProof/>
+        </w:rPr>
+        <w:drawing>
+          <wp:anchor distT="0" distB="0" distL="114300" distR="114300" simplePos="0" relativeHeight="251673600" behindDoc="0" locked="0" layoutInCell="1" allowOverlap="1" wp14:anchorId="3817A469">
+            <wp:simplePos x="0" y="0"/>
+            <wp:positionH relativeFrom="margin">
+              <wp:posOffset>-114300</wp:posOffset>
+            </wp:positionH>
+            <wp:positionV relativeFrom="paragraph">
+              <wp:posOffset>5619750</wp:posOffset>
+            </wp:positionV>
+            <wp:extent cx="5760720" cy="2818765"/>
+            <wp:effectExtent l="0" t="0" r="0" b="635"/>
+            <wp:wrapThrough wrapText="bothSides">
+              <wp:wrapPolygon edited="0">
+                <wp:start x="0" y="0"/>
+                <wp:lineTo x="0" y="21459"/>
+                <wp:lineTo x="21500" y="21459"/>
+                <wp:lineTo x="21500" y="0"/>
+                <wp:lineTo x="0" y="0"/>
+              </wp:wrapPolygon>
+            </wp:wrapThrough>
+            <wp:docPr id="17" name="Kép 17"/>
+            <wp:cNvGraphicFramePr>
+              <a:graphicFrameLocks xmlns:a="http://schemas.openxmlformats.org/drawingml/2006/main" noChangeAspect="1"/>
+            </wp:cNvGraphicFramePr>
+            <a:graphic xmlns:a="http://schemas.openxmlformats.org/drawingml/2006/main">
+              <a:graphicData uri="http://schemas.openxmlformats.org/drawingml/2006/picture">
+                <pic:pic xmlns:pic="http://schemas.openxmlformats.org/drawingml/2006/picture">
+                  <pic:nvPicPr>
+                    <pic:cNvPr id="1" name=""/>
+                    <pic:cNvPicPr/>
+                  </pic:nvPicPr>
+                  <pic:blipFill>
+                    <a:blip r:embed="rId18" cstate="print">
+                      <a:extLst>
+                        <a:ext uri="{28A0092B-C50C-407E-A947-70E740481C1C}">
+                          <a14:useLocalDpi xmlns:a14="http://schemas.microsoft.com/office/drawing/2010/main" val="0"/>
+                        </a:ext>
+                      </a:extLst>
+                    </a:blip>
+                    <a:stretch>
+                      <a:fillRect/>
+                    </a:stretch>
+                  </pic:blipFill>
+                  <pic:spPr>
+                    <a:xfrm>
+                      <a:off x="0" y="0"/>
+                      <a:ext cx="5760720" cy="2818765"/>
+                    </a:xfrm>
+                    <a:prstGeom prst="rect">
+                      <a:avLst/>
+                    </a:prstGeom>
+                  </pic:spPr>
+                </pic:pic>
+              </a:graphicData>
+            </a:graphic>
+          </wp:anchor>
+        </w:drawing>
+      </w:r>
+      <w:r>
+        <w:rPr>
+          <w:rFonts w:ascii="Times New Roman" w:eastAsia="Times New Roman" w:hAnsi="Times New Roman" w:cs="Times New Roman"/>
+          <w:sz w:val="24"/>
+          <w:szCs w:val="24"/>
+          <w:lang w:eastAsia="hu-HU"/>
+        </w:rPr>
+        <w:drawing>
+          <wp:anchor distT="0" distB="0" distL="114300" distR="114300" simplePos="0" relativeHeight="251669504" behindDoc="0" locked="0" layoutInCell="1" allowOverlap="1" wp14:anchorId="109E9515">
+            <wp:simplePos x="0" y="0"/>
+            <wp:positionH relativeFrom="margin">
+              <wp:posOffset>-123825</wp:posOffset>
+            </wp:positionH>
+            <wp:positionV relativeFrom="paragraph">
+              <wp:posOffset>276225</wp:posOffset>
+            </wp:positionV>
+            <wp:extent cx="5760720" cy="2757170"/>
+            <wp:effectExtent l="0" t="0" r="0" b="5080"/>
+            <wp:wrapThrough wrapText="bothSides">
+              <wp:wrapPolygon edited="0">
+                <wp:start x="0" y="0"/>
+                <wp:lineTo x="0" y="21491"/>
+                <wp:lineTo x="21500" y="21491"/>
+                <wp:lineTo x="21500" y="0"/>
+                <wp:lineTo x="0" y="0"/>
+              </wp:wrapPolygon>
+            </wp:wrapThrough>
+            <wp:docPr id="13" name="Kép 13"/>
+            <wp:cNvGraphicFramePr>
+              <a:graphicFrameLocks xmlns:a="http://schemas.openxmlformats.org/drawingml/2006/main" noChangeAspect="1"/>
+            </wp:cNvGraphicFramePr>
+            <a:graphic xmlns:a="http://schemas.openxmlformats.org/drawingml/2006/main">
+              <a:graphicData uri="http://schemas.openxmlformats.org/drawingml/2006/picture">
+                <pic:pic xmlns:pic="http://schemas.openxmlformats.org/drawingml/2006/picture">
+                  <pic:nvPicPr>
+                    <pic:cNvPr id="1" name=""/>
+                    <pic:cNvPicPr/>
+                  </pic:nvPicPr>
+                  <pic:blipFill>
+                    <a:blip r:embed="rId19" cstate="print">
+                      <a:extLst>
+                        <a:ext uri="{28A0092B-C50C-407E-A947-70E740481C1C}">
+                          <a14:useLocalDpi xmlns:a14="http://schemas.microsoft.com/office/drawing/2010/main" val="0"/>
+                        </a:ext>
+                      </a:extLst>
+                    </a:blip>
+                    <a:stretch>
+                      <a:fillRect/>
+                    </a:stretch>
+                  </pic:blipFill>
+                  <pic:spPr>
+                    <a:xfrm>
+                      <a:off x="0" y="0"/>
+                      <a:ext cx="5760720" cy="2757170"/>
+                    </a:xfrm>
+                    <a:prstGeom prst="rect">
+                      <a:avLst/>
+                    </a:prstGeom>
+                  </pic:spPr>
+                </pic:pic>
+              </a:graphicData>
+            </a:graphic>
+          </wp:anchor>
+        </w:drawing>
+      </w:r>
+      <w:r>
+        <w:rPr>
           <w:rFonts w:ascii="Times New Roman" w:eastAsia="Times New Roman" w:hAnsi="Times New Roman" w:cs="Times New Roman"/>
           <w:sz w:val="24"/>
           <w:szCs w:val="24"/>
@@ -2497,6 +3450,12 @@
         </w:rPr>
         <w:t xml:space="preserve"> felhasználó esetén a navigációban jelenik meg.</w:t>
       </w:r>
+      <w:r>
+        <w:rPr>
+          <w:noProof/>
+        </w:rPr>
+        <w:t xml:space="preserve"> </w:t>
+      </w:r>
     </w:p>
     <w:p>
       <w:pPr>
@@ -2510,15 +3469,142 @@
       </w:pPr>
       <w:r>
         <w:rPr>
+          <w:noProof/>
+        </w:rPr>
+        <w:lastRenderedPageBreak/>
+        <w:drawing>
+          <wp:anchor distT="0" distB="0" distL="114300" distR="114300" simplePos="0" relativeHeight="251671552" behindDoc="0" locked="0" layoutInCell="1" allowOverlap="1" wp14:anchorId="44C21307">
+            <wp:simplePos x="0" y="0"/>
+            <wp:positionH relativeFrom="margin">
+              <wp:align>right</wp:align>
+            </wp:positionH>
+            <wp:positionV relativeFrom="paragraph">
+              <wp:posOffset>3007995</wp:posOffset>
+            </wp:positionV>
+            <wp:extent cx="5760720" cy="2863215"/>
+            <wp:effectExtent l="0" t="0" r="0" b="0"/>
+            <wp:wrapThrough wrapText="bothSides">
+              <wp:wrapPolygon edited="0">
+                <wp:start x="0" y="0"/>
+                <wp:lineTo x="0" y="21413"/>
+                <wp:lineTo x="21500" y="21413"/>
+                <wp:lineTo x="21500" y="0"/>
+                <wp:lineTo x="0" y="0"/>
+              </wp:wrapPolygon>
+            </wp:wrapThrough>
+            <wp:docPr id="15" name="Kép 15"/>
+            <wp:cNvGraphicFramePr>
+              <a:graphicFrameLocks xmlns:a="http://schemas.openxmlformats.org/drawingml/2006/main" noChangeAspect="1"/>
+            </wp:cNvGraphicFramePr>
+            <a:graphic xmlns:a="http://schemas.openxmlformats.org/drawingml/2006/main">
+              <a:graphicData uri="http://schemas.openxmlformats.org/drawingml/2006/picture">
+                <pic:pic xmlns:pic="http://schemas.openxmlformats.org/drawingml/2006/picture">
+                  <pic:nvPicPr>
+                    <pic:cNvPr id="1" name=""/>
+                    <pic:cNvPicPr/>
+                  </pic:nvPicPr>
+                  <pic:blipFill>
+                    <a:blip r:embed="rId20" cstate="print">
+                      <a:extLst>
+                        <a:ext uri="{28A0092B-C50C-407E-A947-70E740481C1C}">
+                          <a14:useLocalDpi xmlns:a14="http://schemas.microsoft.com/office/drawing/2010/main" val="0"/>
+                        </a:ext>
+                      </a:extLst>
+                    </a:blip>
+                    <a:stretch>
+                      <a:fillRect/>
+                    </a:stretch>
+                  </pic:blipFill>
+                  <pic:spPr>
+                    <a:xfrm>
+                      <a:off x="0" y="0"/>
+                      <a:ext cx="5760720" cy="2863215"/>
+                    </a:xfrm>
+                    <a:prstGeom prst="rect">
+                      <a:avLst/>
+                    </a:prstGeom>
+                  </pic:spPr>
+                </pic:pic>
+              </a:graphicData>
+            </a:graphic>
+          </wp:anchor>
+        </w:drawing>
+      </w:r>
+      <w:r>
+        <w:rPr>
+          <w:noProof/>
+        </w:rPr>
+        <w:drawing>
+          <wp:anchor distT="0" distB="0" distL="114300" distR="114300" simplePos="0" relativeHeight="251672576" behindDoc="0" locked="0" layoutInCell="1" allowOverlap="1" wp14:anchorId="362C008C">
+            <wp:simplePos x="0" y="0"/>
+            <wp:positionH relativeFrom="margin">
+              <wp:align>right</wp:align>
+            </wp:positionH>
+            <wp:positionV relativeFrom="paragraph">
+              <wp:posOffset>0</wp:posOffset>
+            </wp:positionV>
+            <wp:extent cx="5760720" cy="2863215"/>
+            <wp:effectExtent l="0" t="0" r="0" b="0"/>
+            <wp:wrapThrough wrapText="bothSides">
+              <wp:wrapPolygon edited="0">
+                <wp:start x="0" y="0"/>
+                <wp:lineTo x="0" y="21413"/>
+                <wp:lineTo x="21500" y="21413"/>
+                <wp:lineTo x="21500" y="0"/>
+                <wp:lineTo x="0" y="0"/>
+              </wp:wrapPolygon>
+            </wp:wrapThrough>
+            <wp:docPr id="16" name="Kép 16"/>
+            <wp:cNvGraphicFramePr>
+              <a:graphicFrameLocks xmlns:a="http://schemas.openxmlformats.org/drawingml/2006/main" noChangeAspect="1"/>
+            </wp:cNvGraphicFramePr>
+            <a:graphic xmlns:a="http://schemas.openxmlformats.org/drawingml/2006/main">
+              <a:graphicData uri="http://schemas.openxmlformats.org/drawingml/2006/picture">
+                <pic:pic xmlns:pic="http://schemas.openxmlformats.org/drawingml/2006/picture">
+                  <pic:nvPicPr>
+                    <pic:cNvPr id="1" name=""/>
+                    <pic:cNvPicPr/>
+                  </pic:nvPicPr>
+                  <pic:blipFill>
+                    <a:blip r:embed="rId21" cstate="print">
+                      <a:extLst>
+                        <a:ext uri="{28A0092B-C50C-407E-A947-70E740481C1C}">
+                          <a14:useLocalDpi xmlns:a14="http://schemas.microsoft.com/office/drawing/2010/main" val="0"/>
+                        </a:ext>
+                      </a:extLst>
+                    </a:blip>
+                    <a:stretch>
+                      <a:fillRect/>
+                    </a:stretch>
+                  </pic:blipFill>
+                  <pic:spPr>
+                    <a:xfrm>
+                      <a:off x="0" y="0"/>
+                      <a:ext cx="5760720" cy="2863215"/>
+                    </a:xfrm>
+                    <a:prstGeom prst="rect">
+                      <a:avLst/>
+                    </a:prstGeom>
+                  </pic:spPr>
+                </pic:pic>
+              </a:graphicData>
+            </a:graphic>
+          </wp:anchor>
+        </w:drawing>
+      </w:r>
+      <w:r>
+        <w:rPr>
           <w:rFonts w:ascii="Times New Roman" w:eastAsia="Times New Roman" w:hAnsi="Times New Roman" w:cs="Times New Roman"/>
           <w:sz w:val="24"/>
           <w:szCs w:val="24"/>
           <w:lang w:eastAsia="hu-HU"/>
         </w:rPr>
         <w:pict>
-          <v:rect id="_x0000_i1055" style="width:0;height:1.5pt" o:hralign="center" o:hrstd="t" o:hr="t" fillcolor="#a0a0a0" stroked="f"/>
+          <v:rect id="_x0000_i1033" style="width:0;height:1.5pt" o:hralign="center" o:hrstd="t" o:hr="t" fillcolor="#a0a0a0" stroked="f"/>
         </w:pict>
       </w:r>
+      <w:bookmarkStart w:id="0" w:name="_GoBack"/>
+      <w:bookmarkEnd w:id="0"/>
     </w:p>
     <w:p>
       <w:pPr>
@@ -2589,6 +3675,12 @@
         </w:rPr>
         <w:t>Rendelés visszaigazolás (termékek, összeg, szállítási cím)</w:t>
       </w:r>
+      <w:r>
+        <w:rPr>
+          <w:noProof/>
+        </w:rPr>
+        <w:t xml:space="preserve"> </w:t>
+      </w:r>
     </w:p>
     <w:p>
       <w:pPr>
@@ -2608,7 +3700,7 @@
           <w:lang w:eastAsia="hu-HU"/>
         </w:rPr>
         <w:pict>
-          <v:rect id="_x0000_i1057" style="width:0;height:1.5pt" o:hralign="center" o:hrstd="t" o:hr="t" fillcolor="#a0a0a0" stroked="f"/>
+          <v:rect id="_x0000_i1034" style="width:0;height:1.5pt" o:hralign="center" o:hrstd="t" o:hr="t" fillcolor="#a0a0a0" stroked="f"/>
         </w:pict>
       </w:r>
     </w:p>

</xml_diff>